<commit_message>
fit: correção dos nomes
</commit_message>
<xml_diff>
--- a/docs/Project_mark_sheet.docx
+++ b/docs/Project_mark_sheet.docx
@@ -290,6 +290,7 @@
           <w:lang w:val="en-AU"/>
         </w:rPr>
         <w:br/>
+        <w:t>Project Team No: 7</w:t>
       </w:r>
       <w:r>
         <w:rPr>
@@ -297,13 +298,11 @@
           <w:bCs/>
           <w:lang w:val="en-AU"/>
         </w:rPr>
-        <w:t xml:space="preserve">Project Team No: </w:t>
       </w:r>
       <w:r>
         <w:rPr>
           <w:color w:val="4472C4" w:themeColor="accent1"/>
         </w:rPr>
-        <w:t>please fill in your team number</w:t>
       </w:r>
     </w:p>
     <w:p>
@@ -321,7 +320,7 @@
           <w:bCs/>
           <w:lang w:val="en-AU"/>
         </w:rPr>
-        <w:t xml:space="preserve">Project </w:t>
+        <w:t>Project Team: P2627421 (Thiago Honorato Ferreira) – P2627394 (Marcelo Oliveira Volpato) – P2627402 (João Vitor Konrad)</w:t>
       </w:r>
       <w:r>
         <w:rPr>
@@ -329,7 +328,6 @@
           <w:bCs/>
           <w:lang w:val="en-AU"/>
         </w:rPr>
-        <w:t>Team</w:t>
       </w:r>
       <w:r>
         <w:rPr>
@@ -337,35 +335,30 @@
           <w:bCs/>
           <w:lang w:val="en-AU"/>
         </w:rPr>
-        <w:t xml:space="preserve">: </w:t>
       </w:r>
       <w:r>
         <w:rPr>
           <w:color w:val="4472C4" w:themeColor="accent1"/>
           <w:lang w:val="en-AU"/>
         </w:rPr>
-        <w:t xml:space="preserve">Please fill in your </w:t>
       </w:r>
       <w:r>
         <w:rPr>
           <w:color w:val="4472C4" w:themeColor="accent1"/>
           <w:lang w:val="en-AU"/>
         </w:rPr>
-        <w:t>member</w:t>
       </w:r>
       <w:r>
         <w:rPr>
           <w:color w:val="4472C4" w:themeColor="accent1"/>
           <w:lang w:val="en-AU"/>
         </w:rPr>
-        <w:t xml:space="preserve"> </w:t>
       </w:r>
       <w:r>
         <w:rPr>
           <w:color w:val="4472C4" w:themeColor="accent1"/>
           <w:lang w:val="en-AU"/>
         </w:rPr>
-        <w:t>name and student ID in the table below</w:t>
       </w:r>
     </w:p>
     <w:tbl>
@@ -628,7 +621,7 @@
                 <w:color w:val="FF0000"/>
                 <w:lang w:val="en-AU"/>
               </w:rPr>
-              <w:t>Marcelo Oliveira</w:t>
+              <w:t>Marcelo Oliveira Volpato</w:t>
             </w:r>
           </w:p>
           <w:p>

</xml_diff>